<commit_message>
get time from pool.ntp.org and update system time in AzureDataService; error in DB access, drop data write to log file; generate zip for deploy
</commit_message>
<xml_diff>
--- a/Notes.docx
+++ b/Notes.docx
@@ -3,8 +3,25 @@
 <w:document xmlns:wpc="http://schemas.microsoft.com/office/word/2010/wordprocessingCanvas" xmlns:cx="http://schemas.microsoft.com/office/drawing/2014/chartex" xmlns:cx1="http://schemas.microsoft.com/office/drawing/2015/9/8/chartex" xmlns:cx2="http://schemas.microsoft.com/office/drawing/2015/10/21/chartex" xmlns:cx3="http://schemas.microsoft.com/office/drawing/2016/5/9/chartex" xmlns:cx4="http://schemas.microsoft.com/office/drawing/2016/5/10/chartex" xmlns:cx5="http://schemas.microsoft.com/office/drawing/2016/5/11/chartex" xmlns:cx6="http://schemas.microsoft.com/office/drawing/2016/5/12/chartex" xmlns:cx7="http://schemas.microsoft.com/office/drawing/2016/5/13/chartex" xmlns:cx8="http://schemas.microsoft.com/office/drawing/2016/5/14/chartex" xmlns:mc="http://schemas.openxmlformats.org/markup-compatibility/2006" xmlns:aink="http://schemas.microsoft.com/office/drawing/2016/ink" xmlns:am3d="http://schemas.microsoft.com/office/drawing/2017/model3d" xmlns:o="urn:schemas-microsoft-com:office:office" xmlns:r="http://schemas.openxmlformats.org/officeDocument/2006/relationships" xmlns:m="http://schemas.openxmlformats.org/officeDocument/2006/math" xmlns:v="urn:schemas-microsoft-com:vml" xmlns:wp14="http://schemas.microsoft.com/office/word/2010/wordprocessingDrawing" xmlns:wp="http://schemas.openxmlformats.org/drawingml/2006/wordprocessingDrawing" xmlns:w10="urn:schemas-microsoft-com:office:word" xmlns:w="http://schemas.openxmlformats.org/wordprocessingml/2006/main" xmlns:w14="http://schemas.microsoft.com/office/word/2010/wordml" xmlns:w15="http://schemas.microsoft.com/office/word/2012/wordml" xmlns:w16cex="http://schemas.microsoft.com/office/word/2018/wordml/cex" xmlns:w16cid="http://schemas.microsoft.com/office/word/2016/wordml/cid" xmlns:w16="http://schemas.microsoft.com/office/word/2018/wordml" xmlns:w16sdtdh="http://schemas.microsoft.com/office/word/2020/wordml/sdtdatahash" xmlns:w16se="http://schemas.microsoft.com/office/word/2015/wordml/symex" xmlns:wpg="http://schemas.microsoft.com/office/word/2010/wordprocessingGroup" xmlns:wpi="http://schemas.microsoft.com/office/word/2010/wordprocessingInk" xmlns:wne="http://schemas.microsoft.com/office/word/2006/wordml" xmlns:wps="http://schemas.microsoft.com/office/word/2010/wordprocessingShape" mc:Ignorable="w14 w15 w16se w16cid w16 w16cex w16sdtdh wp14">
   <w:body>
     <w:p>
+      <w:pPr>
+        <w:pStyle w:val="Heading1"/>
+      </w:pPr>
       <w:r>
-        <w:t>Notes file created in version 1.1.2 of CentralMaster</w:t>
+        <w:t>DataServices (or DCDataServices) version information and Notes</w:t>
+      </w:r>
+    </w:p>
+    <w:p>
+      <w:r>
+        <w:t>Notes file created in version 1.1.</w:t>
+      </w:r>
+      <w:r>
+        <w:t>1</w:t>
+      </w:r>
+      <w:r>
+        <w:t xml:space="preserve"> of </w:t>
+      </w:r>
+      <w:r>
+        <w:t>DCDataServices</w:t>
       </w:r>
     </w:p>
     <w:tbl>
@@ -305,6 +322,13 @@
                 <w:szCs w:val="24"/>
               </w:rPr>
             </w:pPr>
+            <w:r>
+              <w:rPr>
+                <w:sz w:val="24"/>
+                <w:szCs w:val="24"/>
+              </w:rPr>
+              <w:t>2</w:t>
+            </w:r>
           </w:p>
         </w:tc>
         <w:tc>
@@ -318,6 +342,13 @@
                 <w:szCs w:val="24"/>
               </w:rPr>
             </w:pPr>
+            <w:r>
+              <w:rPr>
+                <w:sz w:val="24"/>
+                <w:szCs w:val="24"/>
+              </w:rPr>
+              <w:t>8/28/2021</w:t>
+            </w:r>
           </w:p>
         </w:tc>
         <w:tc>
@@ -331,6 +362,13 @@
                 <w:szCs w:val="24"/>
               </w:rPr>
             </w:pPr>
+            <w:r>
+              <w:rPr>
+                <w:sz w:val="24"/>
+                <w:szCs w:val="24"/>
+              </w:rPr>
+              <w:t>Viswanath</w:t>
+            </w:r>
           </w:p>
         </w:tc>
         <w:tc>
@@ -344,6 +382,13 @@
                 <w:szCs w:val="24"/>
               </w:rPr>
             </w:pPr>
+            <w:r>
+              <w:rPr>
+                <w:sz w:val="24"/>
+                <w:szCs w:val="24"/>
+              </w:rPr>
+              <w:t>1.1.2</w:t>
+            </w:r>
           </w:p>
         </w:tc>
         <w:tc>
@@ -357,6 +402,35 @@
                 <w:szCs w:val="24"/>
               </w:rPr>
             </w:pPr>
+            <w:r>
+              <w:rPr>
+                <w:sz w:val="24"/>
+                <w:szCs w:val="24"/>
+              </w:rPr>
+              <w:t>(1) Added time check for pool.ntp.org in Azure table service. If able to get time and set DC time, then perform uploads, else write to DB store</w:t>
+            </w:r>
+          </w:p>
+          <w:p>
+            <w:pPr>
+              <w:rPr>
+                <w:sz w:val="24"/>
+                <w:szCs w:val="24"/>
+              </w:rPr>
+            </w:pPr>
+            <w:r>
+              <w:rPr>
+                <w:sz w:val="24"/>
+                <w:szCs w:val="24"/>
+              </w:rPr>
+              <w:t xml:space="preserve"> (2) If there is any error in InitDB (media card not accessible), drop the data and display dropped data to LoggerUtils.DCLogger.</w:t>
+            </w:r>
+            <w:r>
+              <w:rPr>
+                <w:sz w:val="24"/>
+                <w:szCs w:val="24"/>
+              </w:rPr>
+              <w:t xml:space="preserve"> Added script to generate zip file and store in “publish_release” directory in the deploy.bat file.</w:t>
+            </w:r>
           </w:p>
         </w:tc>
       </w:tr>
@@ -1046,6 +1120,27 @@
     <w:name w:val="Normal"/>
     <w:qFormat/>
   </w:style>
+  <w:style w:type="paragraph" w:styleId="Heading1">
+    <w:name w:val="heading 1"/>
+    <w:basedOn w:val="Normal"/>
+    <w:next w:val="Normal"/>
+    <w:link w:val="Heading1Char"/>
+    <w:uiPriority w:val="9"/>
+    <w:qFormat/>
+    <w:rsid w:val="00193F9F"/>
+    <w:pPr>
+      <w:keepNext/>
+      <w:keepLines/>
+      <w:spacing w:before="240" w:after="0"/>
+      <w:outlineLvl w:val="0"/>
+    </w:pPr>
+    <w:rPr>
+      <w:rFonts w:asciiTheme="majorHAnsi" w:eastAsiaTheme="majorEastAsia" w:hAnsiTheme="majorHAnsi" w:cstheme="majorBidi"/>
+      <w:color w:val="2F5496" w:themeColor="accent1" w:themeShade="BF"/>
+      <w:sz w:val="32"/>
+      <w:szCs w:val="32"/>
+    </w:rPr>
+  </w:style>
   <w:style w:type="character" w:default="1" w:styleId="DefaultParagraphFont">
     <w:name w:val="Default Paragraph Font"/>
     <w:uiPriority w:val="1"/>
@@ -1102,6 +1197,19 @@
       <w:ind w:left="720"/>
       <w:contextualSpacing/>
     </w:pPr>
+  </w:style>
+  <w:style w:type="character" w:customStyle="1" w:styleId="Heading1Char">
+    <w:name w:val="Heading 1 Char"/>
+    <w:basedOn w:val="DefaultParagraphFont"/>
+    <w:link w:val="Heading1"/>
+    <w:uiPriority w:val="9"/>
+    <w:rsid w:val="00193F9F"/>
+    <w:rPr>
+      <w:rFonts w:asciiTheme="majorHAnsi" w:eastAsiaTheme="majorEastAsia" w:hAnsiTheme="majorHAnsi" w:cstheme="majorBidi"/>
+      <w:color w:val="2F5496" w:themeColor="accent1" w:themeShade="BF"/>
+      <w:sz w:val="32"/>
+      <w:szCs w:val="32"/>
+    </w:rPr>
   </w:style>
 </w:styles>
 </file>

</xml_diff>

<commit_message>
sending data of same partition key from db to azure; bug fix
</commit_message>
<xml_diff>
--- a/Notes.docx
+++ b/Notes.docx
@@ -446,6 +446,13 @@
                 <w:szCs w:val="24"/>
               </w:rPr>
             </w:pPr>
+            <w:r>
+              <w:rPr>
+                <w:sz w:val="24"/>
+                <w:szCs w:val="24"/>
+              </w:rPr>
+              <w:t>3</w:t>
+            </w:r>
           </w:p>
         </w:tc>
         <w:tc>
@@ -459,6 +466,13 @@
                 <w:szCs w:val="24"/>
               </w:rPr>
             </w:pPr>
+            <w:r>
+              <w:rPr>
+                <w:sz w:val="24"/>
+                <w:szCs w:val="24"/>
+              </w:rPr>
+              <w:t>10/5/2021</w:t>
+            </w:r>
           </w:p>
         </w:tc>
         <w:tc>
@@ -472,6 +486,13 @@
                 <w:szCs w:val="24"/>
               </w:rPr>
             </w:pPr>
+            <w:r>
+              <w:rPr>
+                <w:sz w:val="24"/>
+                <w:szCs w:val="24"/>
+              </w:rPr>
+              <w:t>Viswanath</w:t>
+            </w:r>
           </w:p>
         </w:tc>
         <w:tc>
@@ -485,6 +506,13 @@
                 <w:szCs w:val="24"/>
               </w:rPr>
             </w:pPr>
+            <w:r>
+              <w:rPr>
+                <w:sz w:val="24"/>
+                <w:szCs w:val="24"/>
+              </w:rPr>
+              <w:t>1.1.3</w:t>
+            </w:r>
           </w:p>
         </w:tc>
         <w:tc>
@@ -498,6 +526,58 @@
                 <w:szCs w:val="24"/>
               </w:rPr>
             </w:pPr>
+            <w:r>
+              <w:rPr>
+                <w:sz w:val="24"/>
+                <w:szCs w:val="24"/>
+              </w:rPr>
+              <w:t xml:space="preserve">a) </w:t>
+            </w:r>
+            <w:r>
+              <w:rPr>
+                <w:sz w:val="24"/>
+                <w:szCs w:val="24"/>
+              </w:rPr>
+              <w:t xml:space="preserve">When more than one node exists and there is no internet connection, it is written to database. When connection comes up, the app reads 5 elements and pushes them using a single table batch operation. However, a table batch operation requires only a single partition key, and the 5 elements may not belong to the same partition key (node ser num), and gives an error. Instead, in this release each of the 5 elements are updated in 5 separate table batch update operations. </w:t>
+            </w:r>
+          </w:p>
+          <w:p>
+            <w:pPr>
+              <w:rPr>
+                <w:sz w:val="24"/>
+                <w:szCs w:val="24"/>
+              </w:rPr>
+            </w:pPr>
+            <w:r>
+              <w:rPr>
+                <w:sz w:val="24"/>
+                <w:szCs w:val="24"/>
+              </w:rPr>
+              <w:lastRenderedPageBreak/>
+              <w:t xml:space="preserve">b) </w:t>
+            </w:r>
+            <w:r>
+              <w:rPr>
+                <w:sz w:val="24"/>
+                <w:szCs w:val="24"/>
+              </w:rPr>
+              <w:t>All application parameters will by default go to directory /home/debain/config/dataservices.</w:t>
+            </w:r>
+          </w:p>
+          <w:p>
+            <w:pPr>
+              <w:rPr>
+                <w:sz w:val="24"/>
+                <w:szCs w:val="24"/>
+              </w:rPr>
+            </w:pPr>
+            <w:r>
+              <w:rPr>
+                <w:sz w:val="24"/>
+                <w:szCs w:val="24"/>
+              </w:rPr>
+              <w:t xml:space="preserve">If a command line option is specified it is the parameter directory that the application should use. </w:t>
+            </w:r>
           </w:p>
         </w:tc>
       </w:tr>

</xml_diff>